<commit_message>
after break logic reviving
</commit_message>
<xml_diff>
--- a/Djangopythonservieques.docx
+++ b/Djangopythonservieques.docx
@@ -2005,6 +2005,100 @@
       <w:r>
         <w:rPr>
           <w:rFonts w:ascii="Times New Roman" w:eastAsia="Times New Roman" w:hAnsi="Times New Roman" w:cs="Times New Roman"/>
+          <w:sz w:val="24"/>
+          <w:szCs w:val="24"/>
+          <w:lang w:eastAsia="en-IN"/>
+        </w:rPr>
+        <w:t xml:space="preserve">Find all pairs having same digit sum </w:t>
+      </w:r>
+    </w:p>
+    <w:p>
+      <w:pPr>
+        <w:numPr>
+          <w:ilvl w:val="0"/>
+          <w:numId w:val="3"/>
+        </w:numPr>
+        <w:spacing w:before="100" w:beforeAutospacing="1" w:after="100" w:afterAutospacing="1" w:line="240" w:lineRule="auto"/>
+        <w:rPr>
+          <w:rFonts w:ascii="Times New Roman" w:eastAsia="Times New Roman" w:hAnsi="Times New Roman" w:cs="Times New Roman"/>
+          <w:sz w:val="24"/>
+          <w:szCs w:val="24"/>
+          <w:lang w:eastAsia="en-IN"/>
+        </w:rPr>
+      </w:pPr>
+      <w:r>
+        <w:rPr>
+          <w:rFonts w:ascii="Times New Roman" w:eastAsia="Times New Roman" w:hAnsi="Times New Roman" w:cs="Times New Roman"/>
+          <w:sz w:val="24"/>
+          <w:szCs w:val="24"/>
+          <w:lang w:eastAsia="en-IN"/>
+        </w:rPr>
+        <w:t xml:space="preserve">Arrange by closeness to average </w:t>
+      </w:r>
+    </w:p>
+    <w:p>
+      <w:pPr>
+        <w:numPr>
+          <w:ilvl w:val="0"/>
+          <w:numId w:val="3"/>
+        </w:numPr>
+        <w:spacing w:before="100" w:beforeAutospacing="1" w:after="100" w:afterAutospacing="1" w:line="240" w:lineRule="auto"/>
+        <w:rPr>
+          <w:rFonts w:ascii="Times New Roman" w:eastAsia="Times New Roman" w:hAnsi="Times New Roman" w:cs="Times New Roman"/>
+          <w:sz w:val="24"/>
+          <w:szCs w:val="24"/>
+          <w:lang w:eastAsia="en-IN"/>
+        </w:rPr>
+      </w:pPr>
+      <w:r>
+        <w:rPr>
+          <w:rFonts w:ascii="Times New Roman" w:eastAsia="Times New Roman" w:hAnsi="Times New Roman" w:cs="Times New Roman"/>
+          <w:sz w:val="24"/>
+          <w:szCs w:val="24"/>
+          <w:lang w:eastAsia="en-IN"/>
+        </w:rPr>
+        <w:t xml:space="preserve">Arrange by distance from median </w:t>
+      </w:r>
+    </w:p>
+    <w:p>
+      <w:pPr>
+        <w:spacing w:after="0" w:line="240" w:lineRule="auto"/>
+        <w:rPr>
+          <w:rFonts w:ascii="Times New Roman" w:eastAsia="Times New Roman" w:hAnsi="Times New Roman" w:cs="Times New Roman"/>
+          <w:sz w:val="24"/>
+          <w:szCs w:val="24"/>
+          <w:lang w:eastAsia="en-IN"/>
+        </w:rPr>
+      </w:pPr>
+      <w:r>
+        <w:rPr>
+          <w:rFonts w:ascii="Times New Roman" w:eastAsia="Times New Roman" w:hAnsi="Times New Roman" w:cs="Times New Roman"/>
+          <w:sz w:val="24"/>
+          <w:szCs w:val="24"/>
+          <w:lang w:eastAsia="en-IN"/>
+        </w:rPr>
+        <w:pict w14:anchorId="00CAC2C1">
+          <v:rect id="_x0000_i1027" style="width:0;height:1.5pt" o:hralign="center" o:hrstd="t" o:hr="t" fillcolor="#a0a0a0" stroked="f"/>
+        </w:pict>
+      </w:r>
+    </w:p>
+    <w:p>
+      <w:pPr>
+        <w:spacing w:before="100" w:beforeAutospacing="1" w:after="100" w:afterAutospacing="1" w:line="240" w:lineRule="auto"/>
+        <w:outlineLvl w:val="0"/>
+        <w:rPr>
+          <w:rFonts w:ascii="Times New Roman" w:eastAsia="Times New Roman" w:hAnsi="Times New Roman" w:cs="Times New Roman"/>
+          <w:b/>
+          <w:bCs/>
+          <w:kern w:val="36"/>
+          <w:sz w:val="48"/>
+          <w:szCs w:val="48"/>
+          <w:lang w:eastAsia="en-IN"/>
+        </w:rPr>
+      </w:pPr>
+      <w:r>
+        <w:rPr>
+          <w:rFonts w:ascii="Times New Roman" w:eastAsia="Times New Roman" w:hAnsi="Times New Roman" w:cs="Times New Roman"/>
           <w:noProof/>
           <w:sz w:val="24"/>
           <w:szCs w:val="24"/>
@@ -2013,13 +2107,13 @@
         <mc:AlternateContent>
           <mc:Choice Requires="wps">
             <w:drawing>
-              <wp:anchor distT="0" distB="0" distL="114300" distR="114300" simplePos="0" relativeHeight="251662336" behindDoc="0" locked="0" layoutInCell="1" allowOverlap="1" wp14:anchorId="32C9AB9C" wp14:editId="6E26E537">
+              <wp:anchor distT="0" distB="0" distL="114300" distR="114300" simplePos="0" relativeHeight="251662336" behindDoc="0" locked="0" layoutInCell="1" allowOverlap="1" wp14:anchorId="32C9AB9C" wp14:editId="49B9C407">
                 <wp:simplePos x="0" y="0"/>
                 <wp:positionH relativeFrom="column">
-                  <wp:posOffset>-591608</wp:posOffset>
+                  <wp:posOffset>-561551</wp:posOffset>
                 </wp:positionH>
                 <wp:positionV relativeFrom="paragraph">
-                  <wp:posOffset>174625</wp:posOffset>
+                  <wp:posOffset>625051</wp:posOffset>
                 </wp:positionV>
                 <wp:extent cx="5469466" cy="21166"/>
                 <wp:effectExtent l="209550" t="228600" r="264795" b="245745"/>
@@ -2071,107 +2165,13 @@
           </mc:Choice>
           <mc:Fallback>
             <w:pict>
-              <v:line w14:anchorId="1750FA8A" id="Straight Connector 1" o:spid="_x0000_s1026" style="position:absolute;z-index:251662336;visibility:visible;mso-wrap-style:square;mso-wrap-distance-left:9pt;mso-wrap-distance-top:0;mso-wrap-distance-right:9pt;mso-wrap-distance-bottom:0;mso-position-horizontal:absolute;mso-position-horizontal-relative:text;mso-position-vertical:absolute;mso-position-vertical-relative:text" from="-46.6pt,13.75pt" to="384.05pt,15.4pt" o:gfxdata="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" strokecolor="#4472c4 [3204]" strokeweight="1.5pt">
+              <v:line w14:anchorId="1F683B39" id="Straight Connector 1" o:spid="_x0000_s1026" style="position:absolute;z-index:251662336;visibility:visible;mso-wrap-style:square;mso-wrap-distance-left:9pt;mso-wrap-distance-top:0;mso-wrap-distance-right:9pt;mso-wrap-distance-bottom:0;mso-position-horizontal:absolute;mso-position-horizontal-relative:text;mso-position-vertical:absolute;mso-position-vertical-relative:text" from="-44.2pt,49.2pt" to="386.45pt,50.85pt" o:gfxdata="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" strokecolor="#4472c4 [3204]" strokeweight="1.5pt">
                 <v:stroke joinstyle="miter"/>
               </v:line>
             </w:pict>
           </mc:Fallback>
         </mc:AlternateContent>
       </w:r>
-      <w:r>
-        <w:rPr>
-          <w:rFonts w:ascii="Times New Roman" w:eastAsia="Times New Roman" w:hAnsi="Times New Roman" w:cs="Times New Roman"/>
-          <w:sz w:val="24"/>
-          <w:szCs w:val="24"/>
-          <w:lang w:eastAsia="en-IN"/>
-        </w:rPr>
-        <w:t xml:space="preserve">Find all pairs having same digit sum </w:t>
-      </w:r>
-    </w:p>
-    <w:p>
-      <w:pPr>
-        <w:numPr>
-          <w:ilvl w:val="0"/>
-          <w:numId w:val="3"/>
-        </w:numPr>
-        <w:spacing w:before="100" w:beforeAutospacing="1" w:after="100" w:afterAutospacing="1" w:line="240" w:lineRule="auto"/>
-        <w:rPr>
-          <w:rFonts w:ascii="Times New Roman" w:eastAsia="Times New Roman" w:hAnsi="Times New Roman" w:cs="Times New Roman"/>
-          <w:sz w:val="24"/>
-          <w:szCs w:val="24"/>
-          <w:lang w:eastAsia="en-IN"/>
-        </w:rPr>
-      </w:pPr>
-      <w:r>
-        <w:rPr>
-          <w:rFonts w:ascii="Times New Roman" w:eastAsia="Times New Roman" w:hAnsi="Times New Roman" w:cs="Times New Roman"/>
-          <w:sz w:val="24"/>
-          <w:szCs w:val="24"/>
-          <w:lang w:eastAsia="en-IN"/>
-        </w:rPr>
-        <w:t xml:space="preserve">Arrange by closeness to average </w:t>
-      </w:r>
-    </w:p>
-    <w:p>
-      <w:pPr>
-        <w:numPr>
-          <w:ilvl w:val="0"/>
-          <w:numId w:val="3"/>
-        </w:numPr>
-        <w:spacing w:before="100" w:beforeAutospacing="1" w:after="100" w:afterAutospacing="1" w:line="240" w:lineRule="auto"/>
-        <w:rPr>
-          <w:rFonts w:ascii="Times New Roman" w:eastAsia="Times New Roman" w:hAnsi="Times New Roman" w:cs="Times New Roman"/>
-          <w:sz w:val="24"/>
-          <w:szCs w:val="24"/>
-          <w:lang w:eastAsia="en-IN"/>
-        </w:rPr>
-      </w:pPr>
-      <w:r>
-        <w:rPr>
-          <w:rFonts w:ascii="Times New Roman" w:eastAsia="Times New Roman" w:hAnsi="Times New Roman" w:cs="Times New Roman"/>
-          <w:sz w:val="24"/>
-          <w:szCs w:val="24"/>
-          <w:lang w:eastAsia="en-IN"/>
-        </w:rPr>
-        <w:t xml:space="preserve">Arrange by distance from median </w:t>
-      </w:r>
-    </w:p>
-    <w:p>
-      <w:pPr>
-        <w:spacing w:after="0" w:line="240" w:lineRule="auto"/>
-        <w:rPr>
-          <w:rFonts w:ascii="Times New Roman" w:eastAsia="Times New Roman" w:hAnsi="Times New Roman" w:cs="Times New Roman"/>
-          <w:sz w:val="24"/>
-          <w:szCs w:val="24"/>
-          <w:lang w:eastAsia="en-IN"/>
-        </w:rPr>
-      </w:pPr>
-      <w:r>
-        <w:rPr>
-          <w:rFonts w:ascii="Times New Roman" w:eastAsia="Times New Roman" w:hAnsi="Times New Roman" w:cs="Times New Roman"/>
-          <w:sz w:val="24"/>
-          <w:szCs w:val="24"/>
-          <w:lang w:eastAsia="en-IN"/>
-        </w:rPr>
-        <w:pict w14:anchorId="00CAC2C1">
-          <v:rect id="_x0000_i1027" style="width:0;height:1.5pt" o:hralign="center" o:hrstd="t" o:hr="t" fillcolor="#a0a0a0" stroked="f"/>
-        </w:pict>
-      </w:r>
-    </w:p>
-    <w:p>
-      <w:pPr>
-        <w:spacing w:before="100" w:beforeAutospacing="1" w:after="100" w:afterAutospacing="1" w:line="240" w:lineRule="auto"/>
-        <w:outlineLvl w:val="0"/>
-        <w:rPr>
-          <w:rFonts w:ascii="Times New Roman" w:eastAsia="Times New Roman" w:hAnsi="Times New Roman" w:cs="Times New Roman"/>
-          <w:b/>
-          <w:bCs/>
-          <w:kern w:val="36"/>
-          <w:sz w:val="48"/>
-          <w:szCs w:val="48"/>
-          <w:lang w:eastAsia="en-IN"/>
-        </w:rPr>
-      </w:pPr>
       <w:r>
         <w:rPr>
           <w:rFonts w:ascii="Times New Roman" w:eastAsia="Times New Roman" w:hAnsi="Times New Roman" w:cs="Times New Roman"/>

</xml_diff>

<commit_message>
updated interview questions (03-07-2026)
</commit_message>
<xml_diff>
--- a/Djangopythonservieques.docx
+++ b/Djangopythonservieques.docx
@@ -2264,6 +2264,220 @@
       <w:r>
         <w:rPr>
           <w:rFonts w:ascii="Times New Roman" w:eastAsia="Times New Roman" w:hAnsi="Times New Roman" w:cs="Times New Roman"/>
+          <w:sz w:val="24"/>
+          <w:szCs w:val="24"/>
+          <w:lang w:eastAsia="en-IN"/>
+        </w:rPr>
+        <w:t xml:space="preserve">Find longest consecutive sequence </w:t>
+      </w:r>
+    </w:p>
+    <w:p>
+      <w:pPr>
+        <w:numPr>
+          <w:ilvl w:val="0"/>
+          <w:numId w:val="4"/>
+        </w:numPr>
+        <w:spacing w:before="100" w:beforeAutospacing="1" w:after="100" w:afterAutospacing="1" w:line="240" w:lineRule="auto"/>
+        <w:rPr>
+          <w:rFonts w:ascii="Times New Roman" w:eastAsia="Times New Roman" w:hAnsi="Times New Roman" w:cs="Times New Roman"/>
+          <w:sz w:val="24"/>
+          <w:szCs w:val="24"/>
+          <w:lang w:eastAsia="en-IN"/>
+        </w:rPr>
+      </w:pPr>
+      <w:r>
+        <w:rPr>
+          <w:rFonts w:ascii="Times New Roman" w:eastAsia="Times New Roman" w:hAnsi="Times New Roman" w:cs="Times New Roman"/>
+          <w:sz w:val="24"/>
+          <w:szCs w:val="24"/>
+          <w:lang w:eastAsia="en-IN"/>
+        </w:rPr>
+        <w:t xml:space="preserve">Longest alternating even-odd subarray </w:t>
+      </w:r>
+    </w:p>
+    <w:p>
+      <w:pPr>
+        <w:numPr>
+          <w:ilvl w:val="0"/>
+          <w:numId w:val="4"/>
+        </w:numPr>
+        <w:spacing w:before="100" w:beforeAutospacing="1" w:after="100" w:afterAutospacing="1" w:line="240" w:lineRule="auto"/>
+        <w:rPr>
+          <w:rFonts w:ascii="Times New Roman" w:eastAsia="Times New Roman" w:hAnsi="Times New Roman" w:cs="Times New Roman"/>
+          <w:sz w:val="24"/>
+          <w:szCs w:val="24"/>
+          <w:lang w:eastAsia="en-IN"/>
+        </w:rPr>
+      </w:pPr>
+      <w:r>
+        <w:rPr>
+          <w:rFonts w:ascii="Times New Roman" w:eastAsia="Times New Roman" w:hAnsi="Times New Roman" w:cs="Times New Roman"/>
+          <w:sz w:val="24"/>
+          <w:szCs w:val="24"/>
+          <w:lang w:eastAsia="en-IN"/>
+        </w:rPr>
+        <w:t xml:space="preserve">Find all equilibrium indices </w:t>
+      </w:r>
+    </w:p>
+    <w:p>
+      <w:pPr>
+        <w:numPr>
+          <w:ilvl w:val="0"/>
+          <w:numId w:val="4"/>
+        </w:numPr>
+        <w:spacing w:before="100" w:beforeAutospacing="1" w:after="100" w:afterAutospacing="1" w:line="240" w:lineRule="auto"/>
+        <w:rPr>
+          <w:rFonts w:ascii="Times New Roman" w:eastAsia="Times New Roman" w:hAnsi="Times New Roman" w:cs="Times New Roman"/>
+          <w:sz w:val="24"/>
+          <w:szCs w:val="24"/>
+          <w:lang w:eastAsia="en-IN"/>
+        </w:rPr>
+      </w:pPr>
+      <w:r>
+        <w:rPr>
+          <w:rFonts w:ascii="Times New Roman" w:eastAsia="Times New Roman" w:hAnsi="Times New Roman" w:cs="Times New Roman"/>
+          <w:sz w:val="24"/>
+          <w:szCs w:val="24"/>
+          <w:lang w:eastAsia="en-IN"/>
+        </w:rPr>
+        <w:t xml:space="preserve">Find leaders in array </w:t>
+      </w:r>
+    </w:p>
+    <w:p>
+      <w:pPr>
+        <w:numPr>
+          <w:ilvl w:val="0"/>
+          <w:numId w:val="4"/>
+        </w:numPr>
+        <w:spacing w:before="100" w:beforeAutospacing="1" w:after="100" w:afterAutospacing="1" w:line="240" w:lineRule="auto"/>
+        <w:rPr>
+          <w:rFonts w:ascii="Times New Roman" w:eastAsia="Times New Roman" w:hAnsi="Times New Roman" w:cs="Times New Roman"/>
+          <w:sz w:val="24"/>
+          <w:szCs w:val="24"/>
+          <w:lang w:eastAsia="en-IN"/>
+        </w:rPr>
+      </w:pPr>
+      <w:r>
+        <w:rPr>
+          <w:rFonts w:ascii="Times New Roman" w:eastAsia="Times New Roman" w:hAnsi="Times New Roman" w:cs="Times New Roman"/>
+          <w:sz w:val="24"/>
+          <w:szCs w:val="24"/>
+          <w:lang w:eastAsia="en-IN"/>
+        </w:rPr>
+        <w:t xml:space="preserve">Find all triplets with sum = 0 </w:t>
+      </w:r>
+    </w:p>
+    <w:p>
+      <w:pPr>
+        <w:numPr>
+          <w:ilvl w:val="0"/>
+          <w:numId w:val="4"/>
+        </w:numPr>
+        <w:spacing w:before="100" w:beforeAutospacing="1" w:after="100" w:afterAutospacing="1" w:line="240" w:lineRule="auto"/>
+        <w:rPr>
+          <w:rFonts w:ascii="Times New Roman" w:eastAsia="Times New Roman" w:hAnsi="Times New Roman" w:cs="Times New Roman"/>
+          <w:sz w:val="24"/>
+          <w:szCs w:val="24"/>
+          <w:lang w:eastAsia="en-IN"/>
+        </w:rPr>
+      </w:pPr>
+      <w:r>
+        <w:rPr>
+          <w:rFonts w:ascii="Times New Roman" w:eastAsia="Times New Roman" w:hAnsi="Times New Roman" w:cs="Times New Roman"/>
+          <w:sz w:val="24"/>
+          <w:szCs w:val="24"/>
+          <w:lang w:eastAsia="en-IN"/>
+        </w:rPr>
+        <w:t xml:space="preserve">Find triplet whose sum equals target </w:t>
+      </w:r>
+    </w:p>
+    <w:p>
+      <w:pPr>
+        <w:numPr>
+          <w:ilvl w:val="0"/>
+          <w:numId w:val="4"/>
+        </w:numPr>
+        <w:spacing w:before="100" w:beforeAutospacing="1" w:after="100" w:afterAutospacing="1" w:line="240" w:lineRule="auto"/>
+        <w:rPr>
+          <w:rFonts w:ascii="Times New Roman" w:eastAsia="Times New Roman" w:hAnsi="Times New Roman" w:cs="Times New Roman"/>
+          <w:sz w:val="24"/>
+          <w:szCs w:val="24"/>
+          <w:lang w:eastAsia="en-IN"/>
+        </w:rPr>
+      </w:pPr>
+      <w:r>
+        <w:rPr>
+          <w:rFonts w:ascii="Times New Roman" w:eastAsia="Times New Roman" w:hAnsi="Times New Roman" w:cs="Times New Roman"/>
+          <w:sz w:val="24"/>
+          <w:szCs w:val="24"/>
+          <w:lang w:eastAsia="en-IN"/>
+        </w:rPr>
+        <w:t xml:space="preserve">Find triplet with maximum sum </w:t>
+      </w:r>
+    </w:p>
+    <w:p>
+      <w:pPr>
+        <w:numPr>
+          <w:ilvl w:val="0"/>
+          <w:numId w:val="4"/>
+        </w:numPr>
+        <w:spacing w:before="100" w:beforeAutospacing="1" w:after="100" w:afterAutospacing="1" w:line="240" w:lineRule="auto"/>
+        <w:rPr>
+          <w:rFonts w:ascii="Times New Roman" w:eastAsia="Times New Roman" w:hAnsi="Times New Roman" w:cs="Times New Roman"/>
+          <w:sz w:val="24"/>
+          <w:szCs w:val="24"/>
+          <w:lang w:eastAsia="en-IN"/>
+        </w:rPr>
+      </w:pPr>
+      <w:r>
+        <w:rPr>
+          <w:rFonts w:ascii="Times New Roman" w:eastAsia="Times New Roman" w:hAnsi="Times New Roman" w:cs="Times New Roman"/>
+          <w:sz w:val="24"/>
+          <w:szCs w:val="24"/>
+          <w:lang w:eastAsia="en-IN"/>
+        </w:rPr>
+        <w:t xml:space="preserve">Count triplets with all distinct values </w:t>
+      </w:r>
+    </w:p>
+    <w:p>
+      <w:pPr>
+        <w:spacing w:after="0" w:line="240" w:lineRule="auto"/>
+        <w:rPr>
+          <w:rFonts w:ascii="Times New Roman" w:eastAsia="Times New Roman" w:hAnsi="Times New Roman" w:cs="Times New Roman"/>
+          <w:sz w:val="24"/>
+          <w:szCs w:val="24"/>
+          <w:lang w:eastAsia="en-IN"/>
+        </w:rPr>
+      </w:pPr>
+      <w:r>
+        <w:rPr>
+          <w:rFonts w:ascii="Times New Roman" w:eastAsia="Times New Roman" w:hAnsi="Times New Roman" w:cs="Times New Roman"/>
+          <w:sz w:val="24"/>
+          <w:szCs w:val="24"/>
+          <w:lang w:eastAsia="en-IN"/>
+        </w:rPr>
+        <w:pict w14:anchorId="7D9E0A73">
+          <v:rect id="_x0000_i1028" style="width:0;height:1.5pt" o:hralign="center" o:hrstd="t" o:hr="t" fillcolor="#a0a0a0" stroked="f"/>
+        </w:pict>
+      </w:r>
+    </w:p>
+    <w:p>
+      <w:pPr>
+        <w:spacing w:before="100" w:beforeAutospacing="1" w:after="100" w:afterAutospacing="1" w:line="240" w:lineRule="auto"/>
+        <w:outlineLvl w:val="0"/>
+        <w:rPr>
+          <w:rFonts w:ascii="Times New Roman" w:eastAsia="Times New Roman" w:hAnsi="Times New Roman" w:cs="Times New Roman"/>
+          <w:b/>
+          <w:bCs/>
+          <w:kern w:val="36"/>
+          <w:sz w:val="48"/>
+          <w:szCs w:val="48"/>
+          <w:lang w:eastAsia="en-IN"/>
+        </w:rPr>
+      </w:pPr>
+      <w:r>
+        <w:rPr>
+          <w:rFonts w:ascii="Times New Roman" w:eastAsia="Times New Roman" w:hAnsi="Times New Roman" w:cs="Times New Roman"/>
           <w:noProof/>
           <w:sz w:val="24"/>
           <w:szCs w:val="24"/>
@@ -2272,13 +2486,13 @@
         <mc:AlternateContent>
           <mc:Choice Requires="wps">
             <w:drawing>
-              <wp:anchor distT="0" distB="0" distL="114300" distR="114300" simplePos="0" relativeHeight="251662336" behindDoc="0" locked="0" layoutInCell="1" allowOverlap="1" wp14:anchorId="32C9AB9C" wp14:editId="7191CCBF">
+              <wp:anchor distT="0" distB="0" distL="114300" distR="114300" simplePos="0" relativeHeight="251662336" behindDoc="0" locked="0" layoutInCell="1" allowOverlap="1" wp14:anchorId="32C9AB9C" wp14:editId="57A1EEEE">
                 <wp:simplePos x="0" y="0"/>
                 <wp:positionH relativeFrom="column">
-                  <wp:posOffset>-556260</wp:posOffset>
+                  <wp:posOffset>-543560</wp:posOffset>
                 </wp:positionH>
                 <wp:positionV relativeFrom="paragraph">
-                  <wp:posOffset>179282</wp:posOffset>
+                  <wp:posOffset>549063</wp:posOffset>
                 </wp:positionV>
                 <wp:extent cx="5469466" cy="21166"/>
                 <wp:effectExtent l="0" t="0" r="36195" b="36195"/>
@@ -2323,227 +2537,13 @@
           </mc:Choice>
           <mc:Fallback>
             <w:pict>
-              <v:line w14:anchorId="166D2BD4" id="Straight Connector 1" o:spid="_x0000_s1026" style="position:absolute;z-index:251662336;visibility:visible;mso-wrap-style:square;mso-wrap-distance-left:9pt;mso-wrap-distance-top:0;mso-wrap-distance-right:9pt;mso-wrap-distance-bottom:0;mso-position-horizontal:absolute;mso-position-horizontal-relative:text;mso-position-vertical:absolute;mso-position-vertical-relative:text" from="-43.8pt,14.1pt" to="386.85pt,15.75pt" o:gfxdata="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" strokecolor="#4472c4 [3204]" strokeweight=".5pt">
+              <v:line w14:anchorId="5F0583A4" id="Straight Connector 1" o:spid="_x0000_s1026" style="position:absolute;z-index:251662336;visibility:visible;mso-wrap-style:square;mso-wrap-distance-left:9pt;mso-wrap-distance-top:0;mso-wrap-distance-right:9pt;mso-wrap-distance-bottom:0;mso-position-horizontal:absolute;mso-position-horizontal-relative:text;mso-position-vertical:absolute;mso-position-vertical-relative:text" from="-42.8pt,43.25pt" to="387.85pt,44.9pt" o:gfxdata="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" strokecolor="#4472c4 [3204]" strokeweight=".5pt">
                 <v:stroke joinstyle="miter"/>
               </v:line>
             </w:pict>
           </mc:Fallback>
         </mc:AlternateContent>
       </w:r>
-      <w:r>
-        <w:rPr>
-          <w:rFonts w:ascii="Times New Roman" w:eastAsia="Times New Roman" w:hAnsi="Times New Roman" w:cs="Times New Roman"/>
-          <w:sz w:val="24"/>
-          <w:szCs w:val="24"/>
-          <w:lang w:eastAsia="en-IN"/>
-        </w:rPr>
-        <w:t xml:space="preserve">Find longest consecutive sequence </w:t>
-      </w:r>
-    </w:p>
-    <w:p>
-      <w:pPr>
-        <w:numPr>
-          <w:ilvl w:val="0"/>
-          <w:numId w:val="4"/>
-        </w:numPr>
-        <w:spacing w:before="100" w:beforeAutospacing="1" w:after="100" w:afterAutospacing="1" w:line="240" w:lineRule="auto"/>
-        <w:rPr>
-          <w:rFonts w:ascii="Times New Roman" w:eastAsia="Times New Roman" w:hAnsi="Times New Roman" w:cs="Times New Roman"/>
-          <w:sz w:val="24"/>
-          <w:szCs w:val="24"/>
-          <w:lang w:eastAsia="en-IN"/>
-        </w:rPr>
-      </w:pPr>
-      <w:r>
-        <w:rPr>
-          <w:rFonts w:ascii="Times New Roman" w:eastAsia="Times New Roman" w:hAnsi="Times New Roman" w:cs="Times New Roman"/>
-          <w:sz w:val="24"/>
-          <w:szCs w:val="24"/>
-          <w:lang w:eastAsia="en-IN"/>
-        </w:rPr>
-        <w:t xml:space="preserve">Longest alternating even-odd subarray </w:t>
-      </w:r>
-    </w:p>
-    <w:p>
-      <w:pPr>
-        <w:numPr>
-          <w:ilvl w:val="0"/>
-          <w:numId w:val="4"/>
-        </w:numPr>
-        <w:spacing w:before="100" w:beforeAutospacing="1" w:after="100" w:afterAutospacing="1" w:line="240" w:lineRule="auto"/>
-        <w:rPr>
-          <w:rFonts w:ascii="Times New Roman" w:eastAsia="Times New Roman" w:hAnsi="Times New Roman" w:cs="Times New Roman"/>
-          <w:sz w:val="24"/>
-          <w:szCs w:val="24"/>
-          <w:lang w:eastAsia="en-IN"/>
-        </w:rPr>
-      </w:pPr>
-      <w:r>
-        <w:rPr>
-          <w:rFonts w:ascii="Times New Roman" w:eastAsia="Times New Roman" w:hAnsi="Times New Roman" w:cs="Times New Roman"/>
-          <w:sz w:val="24"/>
-          <w:szCs w:val="24"/>
-          <w:lang w:eastAsia="en-IN"/>
-        </w:rPr>
-        <w:t xml:space="preserve">Find all equilibrium indices </w:t>
-      </w:r>
-    </w:p>
-    <w:p>
-      <w:pPr>
-        <w:numPr>
-          <w:ilvl w:val="0"/>
-          <w:numId w:val="4"/>
-        </w:numPr>
-        <w:spacing w:before="100" w:beforeAutospacing="1" w:after="100" w:afterAutospacing="1" w:line="240" w:lineRule="auto"/>
-        <w:rPr>
-          <w:rFonts w:ascii="Times New Roman" w:eastAsia="Times New Roman" w:hAnsi="Times New Roman" w:cs="Times New Roman"/>
-          <w:sz w:val="24"/>
-          <w:szCs w:val="24"/>
-          <w:lang w:eastAsia="en-IN"/>
-        </w:rPr>
-      </w:pPr>
-      <w:r>
-        <w:rPr>
-          <w:rFonts w:ascii="Times New Roman" w:eastAsia="Times New Roman" w:hAnsi="Times New Roman" w:cs="Times New Roman"/>
-          <w:sz w:val="24"/>
-          <w:szCs w:val="24"/>
-          <w:lang w:eastAsia="en-IN"/>
-        </w:rPr>
-        <w:t xml:space="preserve">Find leaders in array </w:t>
-      </w:r>
-    </w:p>
-    <w:p>
-      <w:pPr>
-        <w:numPr>
-          <w:ilvl w:val="0"/>
-          <w:numId w:val="4"/>
-        </w:numPr>
-        <w:spacing w:before="100" w:beforeAutospacing="1" w:after="100" w:afterAutospacing="1" w:line="240" w:lineRule="auto"/>
-        <w:rPr>
-          <w:rFonts w:ascii="Times New Roman" w:eastAsia="Times New Roman" w:hAnsi="Times New Roman" w:cs="Times New Roman"/>
-          <w:sz w:val="24"/>
-          <w:szCs w:val="24"/>
-          <w:lang w:eastAsia="en-IN"/>
-        </w:rPr>
-      </w:pPr>
-      <w:r>
-        <w:rPr>
-          <w:rFonts w:ascii="Times New Roman" w:eastAsia="Times New Roman" w:hAnsi="Times New Roman" w:cs="Times New Roman"/>
-          <w:sz w:val="24"/>
-          <w:szCs w:val="24"/>
-          <w:lang w:eastAsia="en-IN"/>
-        </w:rPr>
-        <w:t xml:space="preserve">Find all triplets with sum = 0 </w:t>
-      </w:r>
-    </w:p>
-    <w:p>
-      <w:pPr>
-        <w:numPr>
-          <w:ilvl w:val="0"/>
-          <w:numId w:val="4"/>
-        </w:numPr>
-        <w:spacing w:before="100" w:beforeAutospacing="1" w:after="100" w:afterAutospacing="1" w:line="240" w:lineRule="auto"/>
-        <w:rPr>
-          <w:rFonts w:ascii="Times New Roman" w:eastAsia="Times New Roman" w:hAnsi="Times New Roman" w:cs="Times New Roman"/>
-          <w:sz w:val="24"/>
-          <w:szCs w:val="24"/>
-          <w:lang w:eastAsia="en-IN"/>
-        </w:rPr>
-      </w:pPr>
-      <w:r>
-        <w:rPr>
-          <w:rFonts w:ascii="Times New Roman" w:eastAsia="Times New Roman" w:hAnsi="Times New Roman" w:cs="Times New Roman"/>
-          <w:sz w:val="24"/>
-          <w:szCs w:val="24"/>
-          <w:lang w:eastAsia="en-IN"/>
-        </w:rPr>
-        <w:t xml:space="preserve">Find triplet whose sum equals target </w:t>
-      </w:r>
-    </w:p>
-    <w:p>
-      <w:pPr>
-        <w:numPr>
-          <w:ilvl w:val="0"/>
-          <w:numId w:val="4"/>
-        </w:numPr>
-        <w:spacing w:before="100" w:beforeAutospacing="1" w:after="100" w:afterAutospacing="1" w:line="240" w:lineRule="auto"/>
-        <w:rPr>
-          <w:rFonts w:ascii="Times New Roman" w:eastAsia="Times New Roman" w:hAnsi="Times New Roman" w:cs="Times New Roman"/>
-          <w:sz w:val="24"/>
-          <w:szCs w:val="24"/>
-          <w:lang w:eastAsia="en-IN"/>
-        </w:rPr>
-      </w:pPr>
-      <w:r>
-        <w:rPr>
-          <w:rFonts w:ascii="Times New Roman" w:eastAsia="Times New Roman" w:hAnsi="Times New Roman" w:cs="Times New Roman"/>
-          <w:sz w:val="24"/>
-          <w:szCs w:val="24"/>
-          <w:lang w:eastAsia="en-IN"/>
-        </w:rPr>
-        <w:t xml:space="preserve">Find triplet with maximum sum </w:t>
-      </w:r>
-    </w:p>
-    <w:p>
-      <w:pPr>
-        <w:numPr>
-          <w:ilvl w:val="0"/>
-          <w:numId w:val="4"/>
-        </w:numPr>
-        <w:spacing w:before="100" w:beforeAutospacing="1" w:after="100" w:afterAutospacing="1" w:line="240" w:lineRule="auto"/>
-        <w:rPr>
-          <w:rFonts w:ascii="Times New Roman" w:eastAsia="Times New Roman" w:hAnsi="Times New Roman" w:cs="Times New Roman"/>
-          <w:sz w:val="24"/>
-          <w:szCs w:val="24"/>
-          <w:lang w:eastAsia="en-IN"/>
-        </w:rPr>
-      </w:pPr>
-      <w:r>
-        <w:rPr>
-          <w:rFonts w:ascii="Times New Roman" w:eastAsia="Times New Roman" w:hAnsi="Times New Roman" w:cs="Times New Roman"/>
-          <w:sz w:val="24"/>
-          <w:szCs w:val="24"/>
-          <w:lang w:eastAsia="en-IN"/>
-        </w:rPr>
-        <w:t xml:space="preserve">Count triplets with all distinct values </w:t>
-      </w:r>
-    </w:p>
-    <w:p>
-      <w:pPr>
-        <w:spacing w:after="0" w:line="240" w:lineRule="auto"/>
-        <w:rPr>
-          <w:rFonts w:ascii="Times New Roman" w:eastAsia="Times New Roman" w:hAnsi="Times New Roman" w:cs="Times New Roman"/>
-          <w:sz w:val="24"/>
-          <w:szCs w:val="24"/>
-          <w:lang w:eastAsia="en-IN"/>
-        </w:rPr>
-      </w:pPr>
-      <w:r>
-        <w:rPr>
-          <w:rFonts w:ascii="Times New Roman" w:eastAsia="Times New Roman" w:hAnsi="Times New Roman" w:cs="Times New Roman"/>
-          <w:sz w:val="24"/>
-          <w:szCs w:val="24"/>
-          <w:lang w:eastAsia="en-IN"/>
-        </w:rPr>
-        <w:pict w14:anchorId="7D9E0A73">
-          <v:rect id="_x0000_i1028" style="width:0;height:1.5pt" o:hralign="center" o:hrstd="t" o:hr="t" fillcolor="#a0a0a0" stroked="f"/>
-        </w:pict>
-      </w:r>
-    </w:p>
-    <w:p>
-      <w:pPr>
-        <w:spacing w:before="100" w:beforeAutospacing="1" w:after="100" w:afterAutospacing="1" w:line="240" w:lineRule="auto"/>
-        <w:outlineLvl w:val="0"/>
-        <w:rPr>
-          <w:rFonts w:ascii="Times New Roman" w:eastAsia="Times New Roman" w:hAnsi="Times New Roman" w:cs="Times New Roman"/>
-          <w:b/>
-          <w:bCs/>
-          <w:kern w:val="36"/>
-          <w:sz w:val="48"/>
-          <w:szCs w:val="48"/>
-          <w:lang w:eastAsia="en-IN"/>
-        </w:rPr>
-      </w:pPr>
       <w:r>
         <w:rPr>
           <w:rFonts w:ascii="Times New Roman" w:eastAsia="Times New Roman" w:hAnsi="Times New Roman" w:cs="Times New Roman"/>

</xml_diff>

<commit_message>
learned hashing with fix1 and fix2 (06-07-2026)
</commit_message>
<xml_diff>
--- a/Djangopythonservieques.docx
+++ b/Djangopythonservieques.docx
@@ -2478,6 +2478,388 @@
       <w:r>
         <w:rPr>
           <w:rFonts w:ascii="Times New Roman" w:eastAsia="Times New Roman" w:hAnsi="Times New Roman" w:cs="Times New Roman"/>
+          <w:b/>
+          <w:bCs/>
+          <w:kern w:val="36"/>
+          <w:sz w:val="48"/>
+          <w:szCs w:val="48"/>
+          <w:lang w:eastAsia="en-IN"/>
+        </w:rPr>
+        <w:t>Prime Number Based (91–100)</w:t>
+      </w:r>
+    </w:p>
+    <w:p>
+      <w:pPr>
+        <w:numPr>
+          <w:ilvl w:val="0"/>
+          <w:numId w:val="5"/>
+        </w:numPr>
+        <w:spacing w:before="100" w:beforeAutospacing="1" w:after="100" w:afterAutospacing="1" w:line="240" w:lineRule="auto"/>
+        <w:rPr>
+          <w:rFonts w:ascii="Times New Roman" w:eastAsia="Times New Roman" w:hAnsi="Times New Roman" w:cs="Times New Roman"/>
+          <w:sz w:val="24"/>
+          <w:szCs w:val="24"/>
+          <w:lang w:eastAsia="en-IN"/>
+        </w:rPr>
+      </w:pPr>
+      <w:r>
+        <w:rPr>
+          <w:rFonts w:ascii="Times New Roman" w:eastAsia="Times New Roman" w:hAnsi="Times New Roman" w:cs="Times New Roman"/>
+          <w:sz w:val="24"/>
+          <w:szCs w:val="24"/>
+          <w:lang w:eastAsia="en-IN"/>
+        </w:rPr>
+        <w:t xml:space="preserve">Keep only composite numbers </w:t>
+      </w:r>
+    </w:p>
+    <w:p>
+      <w:pPr>
+        <w:numPr>
+          <w:ilvl w:val="0"/>
+          <w:numId w:val="5"/>
+        </w:numPr>
+        <w:spacing w:before="100" w:beforeAutospacing="1" w:after="100" w:afterAutospacing="1" w:line="240" w:lineRule="auto"/>
+        <w:rPr>
+          <w:rFonts w:ascii="Times New Roman" w:eastAsia="Times New Roman" w:hAnsi="Times New Roman" w:cs="Times New Roman"/>
+          <w:sz w:val="24"/>
+          <w:szCs w:val="24"/>
+          <w:lang w:eastAsia="en-IN"/>
+        </w:rPr>
+      </w:pPr>
+      <w:r>
+        <w:rPr>
+          <w:rFonts w:ascii="Times New Roman" w:eastAsia="Times New Roman" w:hAnsi="Times New Roman" w:cs="Times New Roman"/>
+          <w:sz w:val="24"/>
+          <w:szCs w:val="24"/>
+          <w:lang w:eastAsia="en-IN"/>
+        </w:rPr>
+        <w:t xml:space="preserve">Count pairs where both numbers are prime </w:t>
+      </w:r>
+    </w:p>
+    <w:p>
+      <w:pPr>
+        <w:numPr>
+          <w:ilvl w:val="0"/>
+          <w:numId w:val="5"/>
+        </w:numPr>
+        <w:spacing w:before="100" w:beforeAutospacing="1" w:after="100" w:afterAutospacing="1" w:line="240" w:lineRule="auto"/>
+        <w:rPr>
+          <w:rFonts w:ascii="Times New Roman" w:eastAsia="Times New Roman" w:hAnsi="Times New Roman" w:cs="Times New Roman"/>
+          <w:sz w:val="24"/>
+          <w:szCs w:val="24"/>
+          <w:lang w:eastAsia="en-IN"/>
+        </w:rPr>
+      </w:pPr>
+      <w:r>
+        <w:rPr>
+          <w:rFonts w:ascii="Times New Roman" w:eastAsia="Times New Roman" w:hAnsi="Times New Roman" w:cs="Times New Roman"/>
+          <w:sz w:val="24"/>
+          <w:szCs w:val="24"/>
+          <w:lang w:eastAsia="en-IN"/>
+        </w:rPr>
+        <w:t xml:space="preserve">Rotate only prime numbers </w:t>
+      </w:r>
+    </w:p>
+    <w:p>
+      <w:pPr>
+        <w:numPr>
+          <w:ilvl w:val="0"/>
+          <w:numId w:val="5"/>
+        </w:numPr>
+        <w:spacing w:before="100" w:beforeAutospacing="1" w:after="100" w:afterAutospacing="1" w:line="240" w:lineRule="auto"/>
+        <w:rPr>
+          <w:rFonts w:ascii="Times New Roman" w:eastAsia="Times New Roman" w:hAnsi="Times New Roman" w:cs="Times New Roman"/>
+          <w:sz w:val="24"/>
+          <w:szCs w:val="24"/>
+          <w:lang w:eastAsia="en-IN"/>
+        </w:rPr>
+      </w:pPr>
+      <w:r>
+        <w:rPr>
+          <w:rFonts w:ascii="Times New Roman" w:eastAsia="Times New Roman" w:hAnsi="Times New Roman" w:cs="Times New Roman"/>
+          <w:sz w:val="24"/>
+          <w:szCs w:val="24"/>
+          <w:lang w:eastAsia="en-IN"/>
+        </w:rPr>
+        <w:t xml:space="preserve">Replace elements </w:t>
+      </w:r>
+      <w:proofErr w:type="gramStart"/>
+      <w:r>
+        <w:rPr>
+          <w:rFonts w:ascii="Times New Roman" w:eastAsia="Times New Roman" w:hAnsi="Times New Roman" w:cs="Times New Roman"/>
+          <w:sz w:val="24"/>
+          <w:szCs w:val="24"/>
+          <w:lang w:eastAsia="en-IN"/>
+        </w:rPr>
+        <w:t>whose</w:t>
+      </w:r>
+      <w:proofErr w:type="gramEnd"/>
+      <w:r>
+        <w:rPr>
+          <w:rFonts w:ascii="Times New Roman" w:eastAsia="Times New Roman" w:hAnsi="Times New Roman" w:cs="Times New Roman"/>
+          <w:sz w:val="24"/>
+          <w:szCs w:val="24"/>
+          <w:lang w:eastAsia="en-IN"/>
+        </w:rPr>
+        <w:t xml:space="preserve"> binary 1-count is prime </w:t>
+      </w:r>
+    </w:p>
+    <w:p>
+      <w:pPr>
+        <w:numPr>
+          <w:ilvl w:val="0"/>
+          <w:numId w:val="5"/>
+        </w:numPr>
+        <w:spacing w:before="100" w:beforeAutospacing="1" w:after="100" w:afterAutospacing="1" w:line="240" w:lineRule="auto"/>
+        <w:rPr>
+          <w:rFonts w:ascii="Times New Roman" w:eastAsia="Times New Roman" w:hAnsi="Times New Roman" w:cs="Times New Roman"/>
+          <w:sz w:val="24"/>
+          <w:szCs w:val="24"/>
+          <w:lang w:eastAsia="en-IN"/>
+        </w:rPr>
+      </w:pPr>
+      <w:r>
+        <w:rPr>
+          <w:rFonts w:ascii="Times New Roman" w:eastAsia="Times New Roman" w:hAnsi="Times New Roman" w:cs="Times New Roman"/>
+          <w:sz w:val="24"/>
+          <w:szCs w:val="24"/>
+          <w:lang w:eastAsia="en-IN"/>
+        </w:rPr>
+        <w:t xml:space="preserve">Reverse elements at prime indexes </w:t>
+      </w:r>
+    </w:p>
+    <w:p>
+      <w:pPr>
+        <w:numPr>
+          <w:ilvl w:val="0"/>
+          <w:numId w:val="5"/>
+        </w:numPr>
+        <w:spacing w:before="100" w:beforeAutospacing="1" w:after="100" w:afterAutospacing="1" w:line="240" w:lineRule="auto"/>
+        <w:rPr>
+          <w:rFonts w:ascii="Times New Roman" w:eastAsia="Times New Roman" w:hAnsi="Times New Roman" w:cs="Times New Roman"/>
+          <w:sz w:val="24"/>
+          <w:szCs w:val="24"/>
+          <w:lang w:eastAsia="en-IN"/>
+        </w:rPr>
+      </w:pPr>
+      <w:r>
+        <w:rPr>
+          <w:rFonts w:ascii="Times New Roman" w:eastAsia="Times New Roman" w:hAnsi="Times New Roman" w:cs="Times New Roman"/>
+          <w:sz w:val="24"/>
+          <w:szCs w:val="24"/>
+          <w:lang w:eastAsia="en-IN"/>
+        </w:rPr>
+        <w:t>Count square-</w:t>
+      </w:r>
+      <w:proofErr w:type="spellStart"/>
+      <w:r>
+        <w:rPr>
+          <w:rFonts w:ascii="Times New Roman" w:eastAsia="Times New Roman" w:hAnsi="Times New Roman" w:cs="Times New Roman"/>
+          <w:sz w:val="24"/>
+          <w:szCs w:val="24"/>
+          <w:lang w:eastAsia="en-IN"/>
+        </w:rPr>
+        <w:t>root</w:t>
+      </w:r>
+      <w:proofErr w:type="spellEnd"/>
+      <w:r>
+        <w:rPr>
+          <w:rFonts w:ascii="Times New Roman" w:eastAsia="Times New Roman" w:hAnsi="Times New Roman" w:cs="Times New Roman"/>
+          <w:sz w:val="24"/>
+          <w:szCs w:val="24"/>
+          <w:lang w:eastAsia="en-IN"/>
+        </w:rPr>
+        <w:t xml:space="preserve"> digit sums that are even </w:t>
+      </w:r>
+    </w:p>
+    <w:p>
+      <w:pPr>
+        <w:numPr>
+          <w:ilvl w:val="0"/>
+          <w:numId w:val="5"/>
+        </w:numPr>
+        <w:spacing w:before="100" w:beforeAutospacing="1" w:after="100" w:afterAutospacing="1" w:line="240" w:lineRule="auto"/>
+        <w:rPr>
+          <w:rFonts w:ascii="Times New Roman" w:eastAsia="Times New Roman" w:hAnsi="Times New Roman" w:cs="Times New Roman"/>
+          <w:sz w:val="24"/>
+          <w:szCs w:val="24"/>
+          <w:lang w:eastAsia="en-IN"/>
+        </w:rPr>
+      </w:pPr>
+      <w:r>
+        <w:rPr>
+          <w:rFonts w:ascii="Times New Roman" w:eastAsia="Times New Roman" w:hAnsi="Times New Roman" w:cs="Times New Roman"/>
+          <w:sz w:val="24"/>
+          <w:szCs w:val="24"/>
+          <w:lang w:eastAsia="en-IN"/>
+        </w:rPr>
+        <w:t xml:space="preserve">Find pair with GCD &gt; 1 </w:t>
+      </w:r>
+    </w:p>
+    <w:p>
+      <w:pPr>
+        <w:numPr>
+          <w:ilvl w:val="0"/>
+          <w:numId w:val="5"/>
+        </w:numPr>
+        <w:spacing w:before="100" w:beforeAutospacing="1" w:after="100" w:afterAutospacing="1" w:line="240" w:lineRule="auto"/>
+        <w:rPr>
+          <w:rFonts w:ascii="Times New Roman" w:eastAsia="Times New Roman" w:hAnsi="Times New Roman" w:cs="Times New Roman"/>
+          <w:sz w:val="24"/>
+          <w:szCs w:val="24"/>
+          <w:lang w:eastAsia="en-IN"/>
+        </w:rPr>
+      </w:pPr>
+      <w:r>
+        <w:rPr>
+          <w:rFonts w:ascii="Times New Roman" w:eastAsia="Times New Roman" w:hAnsi="Times New Roman" w:cs="Times New Roman"/>
+          <w:sz w:val="24"/>
+          <w:szCs w:val="24"/>
+          <w:lang w:eastAsia="en-IN"/>
+        </w:rPr>
+        <w:t xml:space="preserve">Move perfect squares to front </w:t>
+      </w:r>
+    </w:p>
+    <w:p>
+      <w:pPr>
+        <w:numPr>
+          <w:ilvl w:val="0"/>
+          <w:numId w:val="5"/>
+        </w:numPr>
+        <w:spacing w:before="100" w:beforeAutospacing="1" w:after="100" w:afterAutospacing="1" w:line="240" w:lineRule="auto"/>
+        <w:rPr>
+          <w:rFonts w:ascii="Times New Roman" w:eastAsia="Times New Roman" w:hAnsi="Times New Roman" w:cs="Times New Roman"/>
+          <w:sz w:val="24"/>
+          <w:szCs w:val="24"/>
+          <w:lang w:eastAsia="en-IN"/>
+        </w:rPr>
+      </w:pPr>
+      <w:r>
+        <w:rPr>
+          <w:rFonts w:ascii="Times New Roman" w:eastAsia="Times New Roman" w:hAnsi="Times New Roman" w:cs="Times New Roman"/>
+          <w:sz w:val="24"/>
+          <w:szCs w:val="24"/>
+          <w:lang w:eastAsia="en-IN"/>
+        </w:rPr>
+        <w:t xml:space="preserve">Reverse subarrays whose sum is prime </w:t>
+      </w:r>
+    </w:p>
+    <w:p>
+      <w:pPr>
+        <w:numPr>
+          <w:ilvl w:val="0"/>
+          <w:numId w:val="5"/>
+        </w:numPr>
+        <w:spacing w:before="100" w:beforeAutospacing="1" w:after="100" w:afterAutospacing="1" w:line="240" w:lineRule="auto"/>
+        <w:rPr>
+          <w:rFonts w:ascii="Times New Roman" w:eastAsia="Times New Roman" w:hAnsi="Times New Roman" w:cs="Times New Roman"/>
+          <w:sz w:val="24"/>
+          <w:szCs w:val="24"/>
+          <w:lang w:eastAsia="en-IN"/>
+        </w:rPr>
+      </w:pPr>
+      <w:r>
+        <w:rPr>
+          <w:rFonts w:ascii="Times New Roman" w:eastAsia="Times New Roman" w:hAnsi="Times New Roman" w:cs="Times New Roman"/>
+          <w:sz w:val="24"/>
+          <w:szCs w:val="24"/>
+          <w:lang w:eastAsia="en-IN"/>
+        </w:rPr>
+        <w:t xml:space="preserve">Prime frequency-based replacement </w:t>
+      </w:r>
+    </w:p>
+    <w:p>
+      <w:pPr>
+        <w:spacing w:after="0" w:line="240" w:lineRule="auto"/>
+        <w:rPr>
+          <w:rFonts w:ascii="Times New Roman" w:eastAsia="Times New Roman" w:hAnsi="Times New Roman" w:cs="Times New Roman"/>
+          <w:sz w:val="24"/>
+          <w:szCs w:val="24"/>
+          <w:lang w:eastAsia="en-IN"/>
+        </w:rPr>
+      </w:pPr>
+      <w:r>
+        <w:rPr>
+          <w:rFonts w:ascii="Times New Roman" w:eastAsia="Times New Roman" w:hAnsi="Times New Roman" w:cs="Times New Roman"/>
+          <w:sz w:val="24"/>
+          <w:szCs w:val="24"/>
+          <w:lang w:eastAsia="en-IN"/>
+        </w:rPr>
+        <w:pict w14:anchorId="3303E1A7">
+          <v:rect id="_x0000_i1048" style="width:0;height:1.5pt" o:hralign="center" o:hrstd="t" o:hr="t" fillcolor="#a0a0a0" stroked="f"/>
+        </w:pict>
+      </w:r>
+    </w:p>
+    <w:p>
+      <w:pPr>
+        <w:spacing w:before="100" w:beforeAutospacing="1" w:after="100" w:afterAutospacing="1" w:line="240" w:lineRule="auto"/>
+        <w:outlineLvl w:val="0"/>
+        <w:rPr>
+          <w:rFonts w:ascii="Times New Roman" w:eastAsia="Times New Roman" w:hAnsi="Times New Roman" w:cs="Times New Roman"/>
+          <w:b/>
+          <w:bCs/>
+          <w:kern w:val="36"/>
+          <w:sz w:val="48"/>
+          <w:szCs w:val="48"/>
+          <w:lang w:eastAsia="en-IN"/>
+        </w:rPr>
+      </w:pPr>
+      <w:r>
+        <w:rPr>
+          <w:rFonts w:ascii="Times New Roman" w:eastAsia="Times New Roman" w:hAnsi="Times New Roman" w:cs="Times New Roman"/>
+          <w:b/>
+          <w:bCs/>
+          <w:kern w:val="36"/>
+          <w:sz w:val="48"/>
+          <w:szCs w:val="48"/>
+          <w:lang w:eastAsia="en-IN"/>
+        </w:rPr>
+        <w:t>Interview-</w:t>
+      </w:r>
+      <w:proofErr w:type="spellStart"/>
+      <w:r>
+        <w:rPr>
+          <w:rFonts w:ascii="Times New Roman" w:eastAsia="Times New Roman" w:hAnsi="Times New Roman" w:cs="Times New Roman"/>
+          <w:b/>
+          <w:bCs/>
+          <w:kern w:val="36"/>
+          <w:sz w:val="48"/>
+          <w:szCs w:val="48"/>
+          <w:lang w:eastAsia="en-IN"/>
+        </w:rPr>
+        <w:t>Favorite</w:t>
+      </w:r>
+      <w:proofErr w:type="spellEnd"/>
+      <w:r>
+        <w:rPr>
+          <w:rFonts w:ascii="Times New Roman" w:eastAsia="Times New Roman" w:hAnsi="Times New Roman" w:cs="Times New Roman"/>
+          <w:b/>
+          <w:bCs/>
+          <w:kern w:val="36"/>
+          <w:sz w:val="48"/>
+          <w:szCs w:val="48"/>
+          <w:lang w:eastAsia="en-IN"/>
+        </w:rPr>
+        <w:t xml:space="preserve"> Questions (101–120)</w:t>
+      </w:r>
+    </w:p>
+    <w:p>
+      <w:pPr>
+        <w:numPr>
+          <w:ilvl w:val="0"/>
+          <w:numId w:val="6"/>
+        </w:numPr>
+        <w:spacing w:before="100" w:beforeAutospacing="1" w:after="100" w:afterAutospacing="1" w:line="240" w:lineRule="auto"/>
+        <w:rPr>
+          <w:rFonts w:ascii="Times New Roman" w:eastAsia="Times New Roman" w:hAnsi="Times New Roman" w:cs="Times New Roman"/>
+          <w:sz w:val="24"/>
+          <w:szCs w:val="24"/>
+          <w:lang w:eastAsia="en-IN"/>
+        </w:rPr>
+      </w:pPr>
+      <w:r>
+        <w:rPr>
+          <w:rFonts w:ascii="Times New Roman" w:eastAsia="Times New Roman" w:hAnsi="Times New Roman" w:cs="Times New Roman"/>
           <w:noProof/>
           <w:sz w:val="24"/>
           <w:szCs w:val="24"/>
@@ -2486,13 +2868,13 @@
         <mc:AlternateContent>
           <mc:Choice Requires="wps">
             <w:drawing>
-              <wp:anchor distT="0" distB="0" distL="114300" distR="114300" simplePos="0" relativeHeight="251662336" behindDoc="0" locked="0" layoutInCell="1" allowOverlap="1" wp14:anchorId="32C9AB9C" wp14:editId="57A1EEEE">
+              <wp:anchor distT="0" distB="0" distL="114300" distR="114300" simplePos="0" relativeHeight="251662336" behindDoc="0" locked="0" layoutInCell="1" allowOverlap="1" wp14:anchorId="32C9AB9C" wp14:editId="7E8091A3">
                 <wp:simplePos x="0" y="0"/>
-                <wp:positionH relativeFrom="column">
-                  <wp:posOffset>-543560</wp:posOffset>
+                <wp:positionH relativeFrom="page">
+                  <wp:align>left</wp:align>
                 </wp:positionH>
                 <wp:positionV relativeFrom="paragraph">
-                  <wp:posOffset>549063</wp:posOffset>
+                  <wp:posOffset>180975</wp:posOffset>
                 </wp:positionV>
                 <wp:extent cx="5469466" cy="21166"/>
                 <wp:effectExtent l="0" t="0" r="36195" b="36195"/>
@@ -2537,395 +2919,14 @@
           </mc:Choice>
           <mc:Fallback>
             <w:pict>
-              <v:line w14:anchorId="5F0583A4" id="Straight Connector 1" o:spid="_x0000_s1026" style="position:absolute;z-index:251662336;visibility:visible;mso-wrap-style:square;mso-wrap-distance-left:9pt;mso-wrap-distance-top:0;mso-wrap-distance-right:9pt;mso-wrap-distance-bottom:0;mso-position-horizontal:absolute;mso-position-horizontal-relative:text;mso-position-vertical:absolute;mso-position-vertical-relative:text" from="-42.8pt,43.25pt" to="387.85pt,44.9pt" o:gfxdata="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" strokecolor="#4472c4 [3204]" strokeweight=".5pt">
+              <v:line w14:anchorId="428D4F92" id="Straight Connector 1" o:spid="_x0000_s1026" style="position:absolute;z-index:251662336;visibility:visible;mso-wrap-style:square;mso-wrap-distance-left:9pt;mso-wrap-distance-top:0;mso-wrap-distance-right:9pt;mso-wrap-distance-bottom:0;mso-position-horizontal:left;mso-position-horizontal-relative:page;mso-position-vertical:absolute;mso-position-vertical-relative:text" from="0,14.25pt" to="430.65pt,15.9pt" o:gfxdata="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" strokecolor="#4472c4 [3204]" strokeweight=".5pt">
                 <v:stroke joinstyle="miter"/>
+                <w10:wrap anchorx="page"/>
               </v:line>
             </w:pict>
           </mc:Fallback>
         </mc:AlternateContent>
       </w:r>
-      <w:r>
-        <w:rPr>
-          <w:rFonts w:ascii="Times New Roman" w:eastAsia="Times New Roman" w:hAnsi="Times New Roman" w:cs="Times New Roman"/>
-          <w:b/>
-          <w:bCs/>
-          <w:kern w:val="36"/>
-          <w:sz w:val="48"/>
-          <w:szCs w:val="48"/>
-          <w:lang w:eastAsia="en-IN"/>
-        </w:rPr>
-        <w:t>Prime Number Based (91–100)</w:t>
-      </w:r>
-    </w:p>
-    <w:p>
-      <w:pPr>
-        <w:numPr>
-          <w:ilvl w:val="0"/>
-          <w:numId w:val="5"/>
-        </w:numPr>
-        <w:spacing w:before="100" w:beforeAutospacing="1" w:after="100" w:afterAutospacing="1" w:line="240" w:lineRule="auto"/>
-        <w:rPr>
-          <w:rFonts w:ascii="Times New Roman" w:eastAsia="Times New Roman" w:hAnsi="Times New Roman" w:cs="Times New Roman"/>
-          <w:sz w:val="24"/>
-          <w:szCs w:val="24"/>
-          <w:lang w:eastAsia="en-IN"/>
-        </w:rPr>
-      </w:pPr>
-      <w:r>
-        <w:rPr>
-          <w:rFonts w:ascii="Times New Roman" w:eastAsia="Times New Roman" w:hAnsi="Times New Roman" w:cs="Times New Roman"/>
-          <w:sz w:val="24"/>
-          <w:szCs w:val="24"/>
-          <w:lang w:eastAsia="en-IN"/>
-        </w:rPr>
-        <w:t xml:space="preserve">Keep only composite numbers </w:t>
-      </w:r>
-    </w:p>
-    <w:p>
-      <w:pPr>
-        <w:numPr>
-          <w:ilvl w:val="0"/>
-          <w:numId w:val="5"/>
-        </w:numPr>
-        <w:spacing w:before="100" w:beforeAutospacing="1" w:after="100" w:afterAutospacing="1" w:line="240" w:lineRule="auto"/>
-        <w:rPr>
-          <w:rFonts w:ascii="Times New Roman" w:eastAsia="Times New Roman" w:hAnsi="Times New Roman" w:cs="Times New Roman"/>
-          <w:sz w:val="24"/>
-          <w:szCs w:val="24"/>
-          <w:lang w:eastAsia="en-IN"/>
-        </w:rPr>
-      </w:pPr>
-      <w:r>
-        <w:rPr>
-          <w:rFonts w:ascii="Times New Roman" w:eastAsia="Times New Roman" w:hAnsi="Times New Roman" w:cs="Times New Roman"/>
-          <w:sz w:val="24"/>
-          <w:szCs w:val="24"/>
-          <w:lang w:eastAsia="en-IN"/>
-        </w:rPr>
-        <w:t xml:space="preserve">Count pairs where both numbers are prime </w:t>
-      </w:r>
-    </w:p>
-    <w:p>
-      <w:pPr>
-        <w:numPr>
-          <w:ilvl w:val="0"/>
-          <w:numId w:val="5"/>
-        </w:numPr>
-        <w:spacing w:before="100" w:beforeAutospacing="1" w:after="100" w:afterAutospacing="1" w:line="240" w:lineRule="auto"/>
-        <w:rPr>
-          <w:rFonts w:ascii="Times New Roman" w:eastAsia="Times New Roman" w:hAnsi="Times New Roman" w:cs="Times New Roman"/>
-          <w:sz w:val="24"/>
-          <w:szCs w:val="24"/>
-          <w:lang w:eastAsia="en-IN"/>
-        </w:rPr>
-      </w:pPr>
-      <w:r>
-        <w:rPr>
-          <w:rFonts w:ascii="Times New Roman" w:eastAsia="Times New Roman" w:hAnsi="Times New Roman" w:cs="Times New Roman"/>
-          <w:sz w:val="24"/>
-          <w:szCs w:val="24"/>
-          <w:lang w:eastAsia="en-IN"/>
-        </w:rPr>
-        <w:t xml:space="preserve">Rotate only prime numbers </w:t>
-      </w:r>
-    </w:p>
-    <w:p>
-      <w:pPr>
-        <w:numPr>
-          <w:ilvl w:val="0"/>
-          <w:numId w:val="5"/>
-        </w:numPr>
-        <w:spacing w:before="100" w:beforeAutospacing="1" w:after="100" w:afterAutospacing="1" w:line="240" w:lineRule="auto"/>
-        <w:rPr>
-          <w:rFonts w:ascii="Times New Roman" w:eastAsia="Times New Roman" w:hAnsi="Times New Roman" w:cs="Times New Roman"/>
-          <w:sz w:val="24"/>
-          <w:szCs w:val="24"/>
-          <w:lang w:eastAsia="en-IN"/>
-        </w:rPr>
-      </w:pPr>
-      <w:r>
-        <w:rPr>
-          <w:rFonts w:ascii="Times New Roman" w:eastAsia="Times New Roman" w:hAnsi="Times New Roman" w:cs="Times New Roman"/>
-          <w:sz w:val="24"/>
-          <w:szCs w:val="24"/>
-          <w:lang w:eastAsia="en-IN"/>
-        </w:rPr>
-        <w:t xml:space="preserve">Replace elements </w:t>
-      </w:r>
-      <w:proofErr w:type="gramStart"/>
-      <w:r>
-        <w:rPr>
-          <w:rFonts w:ascii="Times New Roman" w:eastAsia="Times New Roman" w:hAnsi="Times New Roman" w:cs="Times New Roman"/>
-          <w:sz w:val="24"/>
-          <w:szCs w:val="24"/>
-          <w:lang w:eastAsia="en-IN"/>
-        </w:rPr>
-        <w:t>whose</w:t>
-      </w:r>
-      <w:proofErr w:type="gramEnd"/>
-      <w:r>
-        <w:rPr>
-          <w:rFonts w:ascii="Times New Roman" w:eastAsia="Times New Roman" w:hAnsi="Times New Roman" w:cs="Times New Roman"/>
-          <w:sz w:val="24"/>
-          <w:szCs w:val="24"/>
-          <w:lang w:eastAsia="en-IN"/>
-        </w:rPr>
-        <w:t xml:space="preserve"> binary 1-count is prime </w:t>
-      </w:r>
-    </w:p>
-    <w:p>
-      <w:pPr>
-        <w:numPr>
-          <w:ilvl w:val="0"/>
-          <w:numId w:val="5"/>
-        </w:numPr>
-        <w:spacing w:before="100" w:beforeAutospacing="1" w:after="100" w:afterAutospacing="1" w:line="240" w:lineRule="auto"/>
-        <w:rPr>
-          <w:rFonts w:ascii="Times New Roman" w:eastAsia="Times New Roman" w:hAnsi="Times New Roman" w:cs="Times New Roman"/>
-          <w:sz w:val="24"/>
-          <w:szCs w:val="24"/>
-          <w:lang w:eastAsia="en-IN"/>
-        </w:rPr>
-      </w:pPr>
-      <w:r>
-        <w:rPr>
-          <w:rFonts w:ascii="Times New Roman" w:eastAsia="Times New Roman" w:hAnsi="Times New Roman" w:cs="Times New Roman"/>
-          <w:sz w:val="24"/>
-          <w:szCs w:val="24"/>
-          <w:lang w:eastAsia="en-IN"/>
-        </w:rPr>
-        <w:t xml:space="preserve">Reverse elements at prime indexes </w:t>
-      </w:r>
-    </w:p>
-    <w:p>
-      <w:pPr>
-        <w:numPr>
-          <w:ilvl w:val="0"/>
-          <w:numId w:val="5"/>
-        </w:numPr>
-        <w:spacing w:before="100" w:beforeAutospacing="1" w:after="100" w:afterAutospacing="1" w:line="240" w:lineRule="auto"/>
-        <w:rPr>
-          <w:rFonts w:ascii="Times New Roman" w:eastAsia="Times New Roman" w:hAnsi="Times New Roman" w:cs="Times New Roman"/>
-          <w:sz w:val="24"/>
-          <w:szCs w:val="24"/>
-          <w:lang w:eastAsia="en-IN"/>
-        </w:rPr>
-      </w:pPr>
-      <w:r>
-        <w:rPr>
-          <w:rFonts w:ascii="Times New Roman" w:eastAsia="Times New Roman" w:hAnsi="Times New Roman" w:cs="Times New Roman"/>
-          <w:sz w:val="24"/>
-          <w:szCs w:val="24"/>
-          <w:lang w:eastAsia="en-IN"/>
-        </w:rPr>
-        <w:t>Count square-</w:t>
-      </w:r>
-      <w:proofErr w:type="spellStart"/>
-      <w:r>
-        <w:rPr>
-          <w:rFonts w:ascii="Times New Roman" w:eastAsia="Times New Roman" w:hAnsi="Times New Roman" w:cs="Times New Roman"/>
-          <w:sz w:val="24"/>
-          <w:szCs w:val="24"/>
-          <w:lang w:eastAsia="en-IN"/>
-        </w:rPr>
-        <w:t>root</w:t>
-      </w:r>
-      <w:proofErr w:type="spellEnd"/>
-      <w:r>
-        <w:rPr>
-          <w:rFonts w:ascii="Times New Roman" w:eastAsia="Times New Roman" w:hAnsi="Times New Roman" w:cs="Times New Roman"/>
-          <w:sz w:val="24"/>
-          <w:szCs w:val="24"/>
-          <w:lang w:eastAsia="en-IN"/>
-        </w:rPr>
-        <w:t xml:space="preserve"> digit sums that are even </w:t>
-      </w:r>
-    </w:p>
-    <w:p>
-      <w:pPr>
-        <w:numPr>
-          <w:ilvl w:val="0"/>
-          <w:numId w:val="5"/>
-        </w:numPr>
-        <w:spacing w:before="100" w:beforeAutospacing="1" w:after="100" w:afterAutospacing="1" w:line="240" w:lineRule="auto"/>
-        <w:rPr>
-          <w:rFonts w:ascii="Times New Roman" w:eastAsia="Times New Roman" w:hAnsi="Times New Roman" w:cs="Times New Roman"/>
-          <w:sz w:val="24"/>
-          <w:szCs w:val="24"/>
-          <w:lang w:eastAsia="en-IN"/>
-        </w:rPr>
-      </w:pPr>
-      <w:r>
-        <w:rPr>
-          <w:rFonts w:ascii="Times New Roman" w:eastAsia="Times New Roman" w:hAnsi="Times New Roman" w:cs="Times New Roman"/>
-          <w:sz w:val="24"/>
-          <w:szCs w:val="24"/>
-          <w:lang w:eastAsia="en-IN"/>
-        </w:rPr>
-        <w:t xml:space="preserve">Find pair with GCD &gt; 1 </w:t>
-      </w:r>
-    </w:p>
-    <w:p>
-      <w:pPr>
-        <w:numPr>
-          <w:ilvl w:val="0"/>
-          <w:numId w:val="5"/>
-        </w:numPr>
-        <w:spacing w:before="100" w:beforeAutospacing="1" w:after="100" w:afterAutospacing="1" w:line="240" w:lineRule="auto"/>
-        <w:rPr>
-          <w:rFonts w:ascii="Times New Roman" w:eastAsia="Times New Roman" w:hAnsi="Times New Roman" w:cs="Times New Roman"/>
-          <w:sz w:val="24"/>
-          <w:szCs w:val="24"/>
-          <w:lang w:eastAsia="en-IN"/>
-        </w:rPr>
-      </w:pPr>
-      <w:r>
-        <w:rPr>
-          <w:rFonts w:ascii="Times New Roman" w:eastAsia="Times New Roman" w:hAnsi="Times New Roman" w:cs="Times New Roman"/>
-          <w:sz w:val="24"/>
-          <w:szCs w:val="24"/>
-          <w:lang w:eastAsia="en-IN"/>
-        </w:rPr>
-        <w:t xml:space="preserve">Move perfect squares to front </w:t>
-      </w:r>
-    </w:p>
-    <w:p>
-      <w:pPr>
-        <w:numPr>
-          <w:ilvl w:val="0"/>
-          <w:numId w:val="5"/>
-        </w:numPr>
-        <w:spacing w:before="100" w:beforeAutospacing="1" w:after="100" w:afterAutospacing="1" w:line="240" w:lineRule="auto"/>
-        <w:rPr>
-          <w:rFonts w:ascii="Times New Roman" w:eastAsia="Times New Roman" w:hAnsi="Times New Roman" w:cs="Times New Roman"/>
-          <w:sz w:val="24"/>
-          <w:szCs w:val="24"/>
-          <w:lang w:eastAsia="en-IN"/>
-        </w:rPr>
-      </w:pPr>
-      <w:r>
-        <w:rPr>
-          <w:rFonts w:ascii="Times New Roman" w:eastAsia="Times New Roman" w:hAnsi="Times New Roman" w:cs="Times New Roman"/>
-          <w:sz w:val="24"/>
-          <w:szCs w:val="24"/>
-          <w:lang w:eastAsia="en-IN"/>
-        </w:rPr>
-        <w:t xml:space="preserve">Reverse subarrays whose sum is prime </w:t>
-      </w:r>
-    </w:p>
-    <w:p>
-      <w:pPr>
-        <w:numPr>
-          <w:ilvl w:val="0"/>
-          <w:numId w:val="5"/>
-        </w:numPr>
-        <w:spacing w:before="100" w:beforeAutospacing="1" w:after="100" w:afterAutospacing="1" w:line="240" w:lineRule="auto"/>
-        <w:rPr>
-          <w:rFonts w:ascii="Times New Roman" w:eastAsia="Times New Roman" w:hAnsi="Times New Roman" w:cs="Times New Roman"/>
-          <w:sz w:val="24"/>
-          <w:szCs w:val="24"/>
-          <w:lang w:eastAsia="en-IN"/>
-        </w:rPr>
-      </w:pPr>
-      <w:r>
-        <w:rPr>
-          <w:rFonts w:ascii="Times New Roman" w:eastAsia="Times New Roman" w:hAnsi="Times New Roman" w:cs="Times New Roman"/>
-          <w:sz w:val="24"/>
-          <w:szCs w:val="24"/>
-          <w:lang w:eastAsia="en-IN"/>
-        </w:rPr>
-        <w:t xml:space="preserve">Prime frequency-based replacement </w:t>
-      </w:r>
-    </w:p>
-    <w:p>
-      <w:pPr>
-        <w:spacing w:after="0" w:line="240" w:lineRule="auto"/>
-        <w:rPr>
-          <w:rFonts w:ascii="Times New Roman" w:eastAsia="Times New Roman" w:hAnsi="Times New Roman" w:cs="Times New Roman"/>
-          <w:sz w:val="24"/>
-          <w:szCs w:val="24"/>
-          <w:lang w:eastAsia="en-IN"/>
-        </w:rPr>
-      </w:pPr>
-      <w:r>
-        <w:rPr>
-          <w:rFonts w:ascii="Times New Roman" w:eastAsia="Times New Roman" w:hAnsi="Times New Roman" w:cs="Times New Roman"/>
-          <w:sz w:val="24"/>
-          <w:szCs w:val="24"/>
-          <w:lang w:eastAsia="en-IN"/>
-        </w:rPr>
-        <w:pict w14:anchorId="3303E1A7">
-          <v:rect id="_x0000_i1029" style="width:0;height:1.5pt" o:hralign="center" o:hrstd="t" o:hr="t" fillcolor="#a0a0a0" stroked="f"/>
-        </w:pict>
-      </w:r>
-    </w:p>
-    <w:p>
-      <w:pPr>
-        <w:spacing w:before="100" w:beforeAutospacing="1" w:after="100" w:afterAutospacing="1" w:line="240" w:lineRule="auto"/>
-        <w:outlineLvl w:val="0"/>
-        <w:rPr>
-          <w:rFonts w:ascii="Times New Roman" w:eastAsia="Times New Roman" w:hAnsi="Times New Roman" w:cs="Times New Roman"/>
-          <w:b/>
-          <w:bCs/>
-          <w:kern w:val="36"/>
-          <w:sz w:val="48"/>
-          <w:szCs w:val="48"/>
-          <w:lang w:eastAsia="en-IN"/>
-        </w:rPr>
-      </w:pPr>
-      <w:r>
-        <w:rPr>
-          <w:rFonts w:ascii="Times New Roman" w:eastAsia="Times New Roman" w:hAnsi="Times New Roman" w:cs="Times New Roman"/>
-          <w:b/>
-          <w:bCs/>
-          <w:kern w:val="36"/>
-          <w:sz w:val="48"/>
-          <w:szCs w:val="48"/>
-          <w:lang w:eastAsia="en-IN"/>
-        </w:rPr>
-        <w:t>Interview-</w:t>
-      </w:r>
-      <w:proofErr w:type="spellStart"/>
-      <w:r>
-        <w:rPr>
-          <w:rFonts w:ascii="Times New Roman" w:eastAsia="Times New Roman" w:hAnsi="Times New Roman" w:cs="Times New Roman"/>
-          <w:b/>
-          <w:bCs/>
-          <w:kern w:val="36"/>
-          <w:sz w:val="48"/>
-          <w:szCs w:val="48"/>
-          <w:lang w:eastAsia="en-IN"/>
-        </w:rPr>
-        <w:t>Favorite</w:t>
-      </w:r>
-      <w:proofErr w:type="spellEnd"/>
-      <w:r>
-        <w:rPr>
-          <w:rFonts w:ascii="Times New Roman" w:eastAsia="Times New Roman" w:hAnsi="Times New Roman" w:cs="Times New Roman"/>
-          <w:b/>
-          <w:bCs/>
-          <w:kern w:val="36"/>
-          <w:sz w:val="48"/>
-          <w:szCs w:val="48"/>
-          <w:lang w:eastAsia="en-IN"/>
-        </w:rPr>
-        <w:t xml:space="preserve"> Questions (101–120)</w:t>
-      </w:r>
-    </w:p>
-    <w:p>
-      <w:pPr>
-        <w:numPr>
-          <w:ilvl w:val="0"/>
-          <w:numId w:val="6"/>
-        </w:numPr>
-        <w:spacing w:before="100" w:beforeAutospacing="1" w:after="100" w:afterAutospacing="1" w:line="240" w:lineRule="auto"/>
-        <w:rPr>
-          <w:rFonts w:ascii="Times New Roman" w:eastAsia="Times New Roman" w:hAnsi="Times New Roman" w:cs="Times New Roman"/>
-          <w:sz w:val="24"/>
-          <w:szCs w:val="24"/>
-          <w:lang w:eastAsia="en-IN"/>
-        </w:rPr>
-      </w:pPr>
       <w:r>
         <w:rPr>
           <w:rFonts w:ascii="Times New Roman" w:eastAsia="Times New Roman" w:hAnsi="Times New Roman" w:cs="Times New Roman"/>

</xml_diff>